<commit_message>
Correct 02.2 to 02.5 wording against the Revision 1 manuscript
</commit_message>
<xml_diff>
--- a/protocol/02_extraction_framework/asb_framework_02_2_extraction_codebook.docx
+++ b/protocol/02_extraction_framework/asb_framework_02_2_extraction_codebook.docx
@@ -2448,7 +2448,7 @@
                 <w:sz w:val="20"/>
                 <w:szCs w:val="20"/>
               </w:rPr>
-              <w:t>Risk tier the tool is designed for. Captures targeting logic at tool level. Distinct from Study_Sample (who was actually studied).</w:t>
+              <w:t>Risk tier the tool is designed for. Captures targeting logic at tool level. Distinct from Study_Sample (who was actually studied). N/A where the record has no human participant sample (policy audits, document analyses, simulation-only studies).</w:t>
             </w:r>
           </w:p>
         </w:tc>
@@ -4384,7 +4384,7 @@
           <w:sz w:val="24"/>
           <w:szCs w:val="24"/>
         </w:rPr>
-        <w:t>The 45 fields comprise 35 main fields plus 15 sub-fields nested within five compound fields (Country_Jurisdiction, Game_Type, Delivery_Mechanism, User_Interaction, Measurement_Method).</w:t>
+        <w:t>The 45 fields comprise 30 standalone fields and 15 sub-fields nested within five compound fields (Country_Jurisdiction, Game_Type, Delivery_Mechanism, User_Interaction, Measurement_Method); they are stored in 37 columns (35 single-cell or compound columns, with Study_Sample split across three).</w:t>
       </w:r>
     </w:p>
     <w:p>

</xml_diff>